<commit_message>
Update writing content and default short fiction
</commit_message>
<xml_diff>
--- a/ChristianMueth_Science_and_tech/A Look Into the James Webb Space Telescope.docx
+++ b/ChristianMueth_Science_and_tech/A Look Into the James Webb Space Telescope.docx
@@ -1,43 +1,7 @@
 
 <file path=word/document.xml><?xml version="1.0" encoding="utf-8"?>
-<w:document xmlns:wpc="http://schemas.microsoft.com/office/word/2010/wordprocessingCanvas" xmlns:cx="http://schemas.microsoft.com/office/drawing/2014/chartex" xmlns:cx1="http://schemas.microsoft.com/office/drawing/2015/9/8/chartex" xmlns:cx2="http://schemas.microsoft.com/office/drawing/2015/10/21/chartex" xmlns:cx3="http://schemas.microsoft.com/office/drawing/2016/5/9/chartex" xmlns:cx4="http://schemas.microsoft.com/office/drawing/2016/5/10/chartex" xmlns:cx5="http://schemas.microsoft.com/office/drawing/2016/5/11/chartex" xmlns:cx6="http://schemas.microsoft.com/office/drawing/2016/5/12/chartex" xmlns:cx7="http://schemas.microsoft.com/office/drawing/2016/5/13/chartex" xmlns:cx8="http://schemas.microsoft.com/office/drawing/2016/5/14/chartex" xmlns:mc="http://schemas.openxmlformats.org/markup-compatibility/2006" xmlns:aink="http://schemas.microsoft.com/office/drawing/2016/ink" xmlns:am3d="http://schemas.microsoft.com/office/drawing/2017/model3d" xmlns:o="urn:schemas-microsoft-com:office:office" xmlns:r="http://schemas.openxmlformats.org/officeDocument/2006/relationships" xmlns:m="http://schemas.openxmlformats.org/officeDocument/2006/math" xmlns:v="urn:schemas-microsoft-com:vml" xmlns:wp14="http://schemas.microsoft.com/office/word/2010/wordprocessingDrawing" xmlns:wp="http://schemas.openxmlformats.org/drawingml/2006/wordprocessingDrawing" xmlns:w10="urn:schemas-microsoft-com:office:word" xmlns:w="http://schemas.openxmlformats.org/wordprocessingml/2006/main" xmlns:w14="http://schemas.microsoft.com/office/word/2010/wordml" xmlns:w15="http://schemas.microsoft.com/office/word/2012/wordml" xmlns:w16cex="http://schemas.microsoft.com/office/word/2018/wordml/cex" xmlns:w16cid="http://schemas.microsoft.com/office/word/2016/wordml/cid" xmlns:w16="http://schemas.microsoft.com/office/word/2018/wordml" xmlns:w16se="http://schemas.microsoft.com/office/word/2015/wordml/symex" xmlns:wpg="http://schemas.microsoft.com/office/word/2010/wordprocessingGroup" xmlns:wpi="http://schemas.microsoft.com/office/word/2010/wordprocessingInk" xmlns:wne="http://schemas.microsoft.com/office/word/2006/wordml" xmlns:wps="http://schemas.microsoft.com/office/word/2010/wordprocessingShape" mc:Ignorable="w14 w15 w16se w16cid w16 w16cex wp14">
+<w:document xmlns:wpc="http://schemas.microsoft.com/office/word/2010/wordprocessingCanvas" xmlns:cx="http://schemas.microsoft.com/office/drawing/2014/chartex" xmlns:cx1="http://schemas.microsoft.com/office/drawing/2015/9/8/chartex" xmlns:cx2="http://schemas.microsoft.com/office/drawing/2015/10/21/chartex" xmlns:cx3="http://schemas.microsoft.com/office/drawing/2016/5/9/chartex" xmlns:cx4="http://schemas.microsoft.com/office/drawing/2016/5/10/chartex" xmlns:cx5="http://schemas.microsoft.com/office/drawing/2016/5/11/chartex" xmlns:cx6="http://schemas.microsoft.com/office/drawing/2016/5/12/chartex" xmlns:cx7="http://schemas.microsoft.com/office/drawing/2016/5/13/chartex" xmlns:cx8="http://schemas.microsoft.com/office/drawing/2016/5/14/chartex" xmlns:mc="http://schemas.openxmlformats.org/markup-compatibility/2006" xmlns:aink="http://schemas.microsoft.com/office/drawing/2016/ink" xmlns:am3d="http://schemas.microsoft.com/office/drawing/2017/model3d" xmlns:o="urn:schemas-microsoft-com:office:office" xmlns:oel="http://schemas.microsoft.com/office/2019/extlst" xmlns:r="http://schemas.openxmlformats.org/officeDocument/2006/relationships" xmlns:m="http://schemas.openxmlformats.org/officeDocument/2006/math" xmlns:v="urn:schemas-microsoft-com:vml" xmlns:wp14="http://schemas.microsoft.com/office/word/2010/wordprocessingDrawing" xmlns:wp="http://schemas.openxmlformats.org/drawingml/2006/wordprocessingDrawing" xmlns:w10="urn:schemas-microsoft-com:office:word" xmlns:w="http://schemas.openxmlformats.org/wordprocessingml/2006/main" xmlns:w14="http://schemas.microsoft.com/office/word/2010/wordml" xmlns:w15="http://schemas.microsoft.com/office/word/2012/wordml" xmlns:w16cex="http://schemas.microsoft.com/office/word/2018/wordml/cex" xmlns:w16cid="http://schemas.microsoft.com/office/word/2016/wordml/cid" xmlns:w16="http://schemas.microsoft.com/office/word/2018/wordml" xmlns:w16du="http://schemas.microsoft.com/office/word/2023/wordml/word16du" xmlns:w16sdtdh="http://schemas.microsoft.com/office/word/2020/wordml/sdtdatahash" xmlns:w16sdtfl="http://schemas.microsoft.com/office/word/2024/wordml/sdtformatlock" xmlns:w16se="http://schemas.microsoft.com/office/word/2015/wordml/symex" xmlns:wpg="http://schemas.microsoft.com/office/word/2010/wordprocessingGroup" xmlns:wpi="http://schemas.microsoft.com/office/word/2010/wordprocessingInk" xmlns:wne="http://schemas.microsoft.com/office/word/2006/wordml" xmlns:wps="http://schemas.microsoft.com/office/word/2010/wordprocessingShape" mc:Ignorable="w14 w15 w16se w16cid w16 w16cex w16sdtdh w16sdtfl w16du wp14">
   <w:body>
-    <w:p>
-      <w:pPr>
-        <w:pStyle w:val="NormalWeb"/>
-        <w:spacing w:before="240" w:beforeAutospacing="0" w:after="240" w:afterAutospacing="0"/>
-        <w:rPr>
-          <w:color w:val="000000"/>
-        </w:rPr>
-      </w:pPr>
-      <w:r>
-        <w:rPr>
-          <w:color w:val="000000"/>
-        </w:rPr>
-        <w:t>By: Christian Mueth</w:t>
-      </w:r>
-    </w:p>
-    <w:p>
-      <w:pPr>
-        <w:pStyle w:val="NormalWeb"/>
-        <w:spacing w:before="240" w:beforeAutospacing="0" w:after="240" w:afterAutospacing="0"/>
-        <w:rPr>
-          <w:color w:val="000000"/>
-        </w:rPr>
-      </w:pPr>
-      <w:r>
-        <w:rPr>
-          <w:color w:val="000000"/>
-        </w:rPr>
-        <w:t>Date: 8/28/2020</w:t>
-      </w:r>
-      <w:r>
-        <w:rPr>
-          <w:color w:val="000000"/>
-        </w:rPr>
-        <w:t>aa</w:t>
-      </w:r>
-    </w:p>
     <w:p>
       <w:pPr>
         <w:pStyle w:val="NormalWeb"/>
@@ -218,25 +182,7 @@
           <w:sz w:val="24"/>
           <w:szCs w:val="24"/>
         </w:rPr>
-        <w:t xml:space="preserve">So, what sort of discoveries might we expect? </w:t>
-      </w:r>
-      <w:r>
-        <w:rPr>
-          <w:rFonts w:ascii="Times New Roman" w:eastAsia="Times New Roman" w:hAnsi="Times New Roman" w:cs="Times New Roman"/>
-          <w:color w:val="000000"/>
-          <w:sz w:val="24"/>
-          <w:szCs w:val="24"/>
-        </w:rPr>
-        <w:t>Well, s</w:t>
-      </w:r>
-      <w:r>
-        <w:rPr>
-          <w:rFonts w:ascii="Times New Roman" w:eastAsia="Times New Roman" w:hAnsi="Times New Roman" w:cs="Times New Roman"/>
-          <w:color w:val="000000"/>
-          <w:sz w:val="24"/>
-          <w:szCs w:val="24"/>
-        </w:rPr>
-        <w:t>ky’s the limit. As stated earlier, the James Webb Telescope is an infrared telescope, meaning it’s excellent at picking up long wavelengths.</w:t>
+        <w:t>So, what sort of discoveries might we expect? Well, sky’s the limit. As stated earlier, the James Webb Telescope is an infrared telescope, meaning it’s excellent at picking up long wavelengths.</w:t>
       </w:r>
       <w:r>
         <w:rPr>
@@ -253,16 +199,7 @@
           <w:sz w:val="24"/>
           <w:szCs w:val="24"/>
         </w:rPr>
-        <w:t>Scientists will study the atmospheres of planets for signs of life – specifically, for planets with carbon dioxide and methane</w:t>
-      </w:r>
-      <w:r>
-        <w:rPr>
-          <w:rFonts w:ascii="Times New Roman" w:eastAsia="Times New Roman" w:hAnsi="Times New Roman" w:cs="Times New Roman"/>
-          <w:color w:val="000000"/>
-          <w:sz w:val="24"/>
-          <w:szCs w:val="24"/>
-        </w:rPr>
-        <w:t>.</w:t>
+        <w:t>Scientists will study the atmospheres of planets for signs of life – specifically, for planets with carbon dioxide and methane.</w:t>
       </w:r>
       <w:r>
         <w:rPr>
@@ -279,106 +216,7 @@
           <w:sz w:val="24"/>
           <w:szCs w:val="24"/>
         </w:rPr>
-        <w:t>It will be able to study the origins of our universe, dating back to just 200 million years after the Big Bang</w:t>
-      </w:r>
-      <w:r>
-        <w:rPr>
-          <w:rFonts w:ascii="Times New Roman" w:eastAsia="Times New Roman" w:hAnsi="Times New Roman" w:cs="Times New Roman"/>
-          <w:color w:val="000000"/>
-          <w:sz w:val="24"/>
-          <w:szCs w:val="24"/>
-        </w:rPr>
-        <w:t xml:space="preserve">. </w:t>
-      </w:r>
-      <w:r>
-        <w:rPr>
-          <w:rFonts w:ascii="Times New Roman" w:eastAsia="Times New Roman" w:hAnsi="Times New Roman" w:cs="Times New Roman"/>
-          <w:color w:val="000000"/>
-          <w:sz w:val="24"/>
-          <w:szCs w:val="24"/>
-        </w:rPr>
-        <w:t>It’ll be used to study the formations of galaxies</w:t>
-      </w:r>
-      <w:r>
-        <w:rPr>
-          <w:rFonts w:ascii="Times New Roman" w:eastAsia="Times New Roman" w:hAnsi="Times New Roman" w:cs="Times New Roman"/>
-          <w:color w:val="000000"/>
-          <w:sz w:val="24"/>
-          <w:szCs w:val="24"/>
-        </w:rPr>
-        <w:t xml:space="preserve">. </w:t>
-      </w:r>
-      <w:r>
-        <w:rPr>
-          <w:rFonts w:ascii="Times New Roman" w:eastAsia="Times New Roman" w:hAnsi="Times New Roman" w:cs="Times New Roman"/>
-          <w:color w:val="000000"/>
-          <w:sz w:val="24"/>
-          <w:szCs w:val="24"/>
-        </w:rPr>
-        <w:t>It will study formation of planets</w:t>
-      </w:r>
-      <w:r>
-        <w:rPr>
-          <w:rFonts w:ascii="Times New Roman" w:eastAsia="Times New Roman" w:hAnsi="Times New Roman" w:cs="Times New Roman"/>
-          <w:color w:val="000000"/>
-          <w:sz w:val="24"/>
-          <w:szCs w:val="24"/>
-        </w:rPr>
-        <w:t xml:space="preserve">. </w:t>
-      </w:r>
-      <w:r>
-        <w:rPr>
-          <w:rFonts w:ascii="Times New Roman" w:eastAsia="Times New Roman" w:hAnsi="Times New Roman" w:cs="Times New Roman"/>
-          <w:color w:val="000000"/>
-          <w:sz w:val="24"/>
-          <w:szCs w:val="24"/>
-        </w:rPr>
-        <w:t>It will chart sections of the universe, faster than ever before</w:t>
-      </w:r>
-      <w:r>
-        <w:rPr>
-          <w:rFonts w:ascii="Times New Roman" w:eastAsia="Times New Roman" w:hAnsi="Times New Roman" w:cs="Times New Roman"/>
-          <w:color w:val="000000"/>
-          <w:sz w:val="24"/>
-          <w:szCs w:val="24"/>
-        </w:rPr>
-        <w:t xml:space="preserve">. </w:t>
-      </w:r>
-      <w:r>
-        <w:rPr>
-          <w:rFonts w:ascii="Times New Roman" w:eastAsia="Times New Roman" w:hAnsi="Times New Roman" w:cs="Times New Roman"/>
-          <w:color w:val="000000"/>
-          <w:sz w:val="24"/>
-          <w:szCs w:val="24"/>
-        </w:rPr>
-        <w:t xml:space="preserve">An interesting study has </w:t>
-      </w:r>
-      <w:r>
-        <w:rPr>
-          <w:rFonts w:ascii="Times New Roman" w:eastAsia="Times New Roman" w:hAnsi="Times New Roman" w:cs="Times New Roman"/>
-          <w:color w:val="000000"/>
-          <w:sz w:val="24"/>
-          <w:szCs w:val="24"/>
-        </w:rPr>
-        <w:t xml:space="preserve">also </w:t>
-      </w:r>
-      <w:r>
-        <w:rPr>
-          <w:rFonts w:ascii="Times New Roman" w:eastAsia="Times New Roman" w:hAnsi="Times New Roman" w:cs="Times New Roman"/>
-          <w:color w:val="000000"/>
-          <w:sz w:val="24"/>
-          <w:szCs w:val="24"/>
-        </w:rPr>
-        <w:t>been announced on how dark matter may affect gravitation between Draco and Sculptor dwarf galaxies</w:t>
-      </w:r>
-      <w:r>
-        <w:rPr>
-          <w:rFonts w:ascii="Times New Roman" w:eastAsia="Times New Roman" w:hAnsi="Times New Roman" w:cs="Times New Roman"/>
-          <w:color w:val="000000"/>
-          <w:sz w:val="24"/>
-          <w:szCs w:val="24"/>
-        </w:rPr>
-        <w:t>.</w:t>
+        <w:t>It will be able to study the origins of our universe, dating back to just 200 million years after the Big Bang. It’ll be used to study the formations of galaxies. It will study formation of planets. It will chart sections of the universe, faster than ever before. An interesting study has also been announced on how dark matter may affect gravitation between Draco and Sculptor dwarf galaxies.</w:t>
       </w:r>
     </w:p>
     <w:p>
@@ -390,20 +228,7 @@
         <w:rPr>
           <w:color w:val="000000"/>
         </w:rPr>
-        <w:lastRenderedPageBreak/>
-        <w:t>What the James Webb Space Telescope is about to do can do pretty much</w:t>
-      </w:r>
-      <w:r>
-        <w:rPr>
-          <w:color w:val="000000"/>
-        </w:rPr>
-        <w:t xml:space="preserve"> </w:t>
-      </w:r>
-      <w:r>
-        <w:rPr>
-          <w:color w:val="000000"/>
-        </w:rPr>
-        <w:t>speaks for itself. Though, the</w:t>
+        <w:t>What the James Webb Space Telescope is about to do can do pretty much speaks for itself. Though, the</w:t>
       </w:r>
       <w:r>
         <w:rPr>
@@ -429,7 +254,14 @@
         <w:rPr>
           <w:color w:val="000000"/>
         </w:rPr>
-        <w:t xml:space="preserve"> does the JWST do all of this? What makes it so much better than say, the Hubble</w:t>
+        <w:t xml:space="preserve"> does the JWST do all of </w:t>
+      </w:r>
+      <w:r>
+        <w:rPr>
+          <w:color w:val="000000"/>
+        </w:rPr>
+        <w:lastRenderedPageBreak/>
+        <w:t>this? What makes it so much better than say, the Hubble</w:t>
       </w:r>
       <w:r>
         <w:rPr>
@@ -457,25 +289,7 @@
         <w:rPr>
           <w:color w:val="000000"/>
         </w:rPr>
-        <w:t>First off, size: the diameter of the JWST’s mirrors are 6.5 meters, as opposed to the Hubble’s 2.4 meters. This gives it a larger field of view, and greater sensitivity to longer wavelengths</w:t>
-      </w:r>
-      <w:r>
-        <w:rPr>
-          <w:color w:val="000000"/>
-        </w:rPr>
-        <w:t xml:space="preserve">. </w:t>
-      </w:r>
-      <w:r>
-        <w:rPr>
-          <w:color w:val="000000"/>
-        </w:rPr>
-        <w:t>Secondly, regarding temperature: NASA split the JWST into three subsections, all of which put emphasis on cryogenics to bring operating temperature down. It operates at “very cold 7 Kelvin”</w:t>
-      </w:r>
-      <w:r>
-        <w:rPr>
-          <w:color w:val="000000"/>
-        </w:rPr>
-        <w:t xml:space="preserve"> </w:t>
+        <w:t xml:space="preserve">First off, size: the diameter of the JWST’s mirrors are 6.5 meters, as opposed to the Hubble’s 2.4 meters. This gives it a larger field of view, and greater sensitivity to longer wavelengths. Secondly, regarding temperature: NASA split the JWST into three subsections, all of which put emphasis on cryogenics to bring operating temperature down. It operates at “very cold 7 Kelvin” </w:t>
       </w:r>
       <w:r>
         <w:rPr>
@@ -487,31 +301,7 @@
         <w:rPr>
           <w:color w:val="000000"/>
         </w:rPr>
-        <w:t>This further allows it to read longer wavelengths.</w:t>
-      </w:r>
-      <w:r>
-        <w:rPr>
-          <w:color w:val="000000"/>
-        </w:rPr>
-        <w:t xml:space="preserve"> </w:t>
-      </w:r>
-      <w:r>
-        <w:rPr>
-          <w:color w:val="000000"/>
-        </w:rPr>
-        <w:t>Of course, general advances in technology help too. The JWST has a massive solar shield to block out sunlight. It also has an instrument module (ISIM) which, among other things, can block out shorter wavelengths of light</w:t>
-      </w:r>
-      <w:r>
-        <w:rPr>
-          <w:color w:val="000000"/>
-        </w:rPr>
-        <w:t xml:space="preserve">. </w:t>
-      </w:r>
-      <w:r>
-        <w:rPr>
-          <w:color w:val="000000"/>
-        </w:rPr>
-        <w:t xml:space="preserve">With </w:t>
+        <w:t xml:space="preserve">This further allows it to read longer wavelengths. Of course, general advances in technology help too. The JWST has a massive solar shield to block out sunlight. It also has an instrument module (ISIM) which, among other things, can block out shorter wavelengths of light. With </w:t>
       </w:r>
       <w:proofErr w:type="gramStart"/>
       <w:r>
@@ -525,13 +315,7 @@
         <w:rPr>
           <w:color w:val="000000"/>
         </w:rPr>
-        <w:t xml:space="preserve"> this combined, the JWST can read wavelengths of 30 microns. Hubble’s max? 1.8</w:t>
-      </w:r>
-      <w:r>
-        <w:rPr>
-          <w:color w:val="000000"/>
-        </w:rPr>
-        <w:t>.</w:t>
+        <w:t xml:space="preserve"> this combined, the JWST can read wavelengths of 30 microns. Hubble’s max? 1.8.</w:t>
       </w:r>
     </w:p>
     <w:p>
@@ -570,7 +354,6 @@
           <w:sz w:val="24"/>
           <w:szCs w:val="24"/>
         </w:rPr>
-        <w:lastRenderedPageBreak/>
         <w:drawing>
           <wp:inline distT="0" distB="0" distL="0" distR="0" wp14:anchorId="4D1FB628" wp14:editId="180A06EE">
             <wp:extent cx="5943600" cy="4946015"/>
@@ -636,6 +419,7 @@
           <w:sz w:val="24"/>
           <w:szCs w:val="24"/>
         </w:rPr>
+        <w:lastRenderedPageBreak/>
         <w:t>Image: NASA</w:t>
       </w:r>
     </w:p>
@@ -796,7 +580,27 @@
           <w:sz w:val="24"/>
           <w:szCs w:val="24"/>
         </w:rPr>
-        <w:t xml:space="preserve"> when 1990’s Hubble launched, the JWST is going to change the face of astronomy. Countless new discoveries are about to emerge.  </w:t>
+        <w:t xml:space="preserve"> when 1990’s Hubble launched, </w:t>
+      </w:r>
+      <w:proofErr w:type="gramStart"/>
+      <w:r>
+        <w:rPr>
+          <w:rFonts w:ascii="Times New Roman" w:eastAsia="Times New Roman" w:hAnsi="Times New Roman" w:cs="Times New Roman"/>
+          <w:color w:val="000000"/>
+          <w:sz w:val="24"/>
+          <w:szCs w:val="24"/>
+        </w:rPr>
+        <w:t>the JWST</w:t>
+      </w:r>
+      <w:proofErr w:type="gramEnd"/>
+      <w:r>
+        <w:rPr>
+          <w:rFonts w:ascii="Times New Roman" w:eastAsia="Times New Roman" w:hAnsi="Times New Roman" w:cs="Times New Roman"/>
+          <w:color w:val="000000"/>
+          <w:sz w:val="24"/>
+          <w:szCs w:val="24"/>
+        </w:rPr>
+        <w:t xml:space="preserve"> is going to change the face of astronomy. Countless new discoveries are about to emerge.  </w:t>
       </w:r>
       <w:proofErr w:type="spellStart"/>
       <w:r>
@@ -816,37 +620,7 @@
           <w:sz w:val="24"/>
           <w:szCs w:val="24"/>
         </w:rPr>
-        <w:t xml:space="preserve"> as the JWST may at first seem, it’s anything but. </w:t>
-      </w:r>
-      <w:proofErr w:type="gramStart"/>
-      <w:r>
-        <w:rPr>
-          <w:rFonts w:ascii="Times New Roman" w:eastAsia="Times New Roman" w:hAnsi="Times New Roman" w:cs="Times New Roman"/>
-          <w:color w:val="000000"/>
-          <w:sz w:val="24"/>
-          <w:szCs w:val="24"/>
-        </w:rPr>
-        <w:t>Thankfully</w:t>
-      </w:r>
-      <w:proofErr w:type="gramEnd"/>
-      <w:r>
-        <w:rPr>
-          <w:rFonts w:ascii="Times New Roman" w:eastAsia="Times New Roman" w:hAnsi="Times New Roman" w:cs="Times New Roman"/>
-          <w:color w:val="000000"/>
-          <w:sz w:val="24"/>
-          <w:szCs w:val="24"/>
-        </w:rPr>
-        <w:t xml:space="preserve"> that’s what </w:t>
-      </w:r>
-      <w:r>
-        <w:rPr>
-          <w:rFonts w:ascii="Times New Roman" w:eastAsia="Times New Roman" w:hAnsi="Times New Roman" w:cs="Times New Roman"/>
-          <w:color w:val="000000"/>
-          <w:sz w:val="24"/>
-          <w:szCs w:val="24"/>
-        </w:rPr>
-        <w:lastRenderedPageBreak/>
-        <w:t>telescopes are best at: taking the things that we might sweep under the rug</w:t>
+        <w:t xml:space="preserve"> as the JWST may at first seem, it’s anything but. Thankfully that’s what telescopes are best at: taking the things that we might sweep under the rug</w:t>
       </w:r>
       <w:r>
         <w:rPr>
@@ -878,7 +652,7 @@
 </file>
 
 <file path=word/numbering.xml><?xml version="1.0" encoding="utf-8"?>
-<w:numbering xmlns:wpc="http://schemas.microsoft.com/office/word/2010/wordprocessingCanvas" xmlns:cx="http://schemas.microsoft.com/office/drawing/2014/chartex" xmlns:cx1="http://schemas.microsoft.com/office/drawing/2015/9/8/chartex" xmlns:cx2="http://schemas.microsoft.com/office/drawing/2015/10/21/chartex" xmlns:cx3="http://schemas.microsoft.com/office/drawing/2016/5/9/chartex" xmlns:cx4="http://schemas.microsoft.com/office/drawing/2016/5/10/chartex" xmlns:cx5="http://schemas.microsoft.com/office/drawing/2016/5/11/chartex" xmlns:cx6="http://schemas.microsoft.com/office/drawing/2016/5/12/chartex" xmlns:cx7="http://schemas.microsoft.com/office/drawing/2016/5/13/chartex" xmlns:cx8="http://schemas.microsoft.com/office/drawing/2016/5/14/chartex" xmlns:mc="http://schemas.openxmlformats.org/markup-compatibility/2006" xmlns:aink="http://schemas.microsoft.com/office/drawing/2016/ink" xmlns:am3d="http://schemas.microsoft.com/office/drawing/2017/model3d" xmlns:o="urn:schemas-microsoft-com:office:office" xmlns:r="http://schemas.openxmlformats.org/officeDocument/2006/relationships" xmlns:m="http://schemas.openxmlformats.org/officeDocument/2006/math" xmlns:v="urn:schemas-microsoft-com:vml" xmlns:wp14="http://schemas.microsoft.com/office/word/2010/wordprocessingDrawing" xmlns:wp="http://schemas.openxmlformats.org/drawingml/2006/wordprocessingDrawing" xmlns:w10="urn:schemas-microsoft-com:office:word" xmlns:w="http://schemas.openxmlformats.org/wordprocessingml/2006/main" xmlns:w14="http://schemas.microsoft.com/office/word/2010/wordml" xmlns:w15="http://schemas.microsoft.com/office/word/2012/wordml" xmlns:w16cex="http://schemas.microsoft.com/office/word/2018/wordml/cex" xmlns:w16cid="http://schemas.microsoft.com/office/word/2016/wordml/cid" xmlns:w16="http://schemas.microsoft.com/office/word/2018/wordml" xmlns:w16se="http://schemas.microsoft.com/office/word/2015/wordml/symex" xmlns:wpg="http://schemas.microsoft.com/office/word/2010/wordprocessingGroup" xmlns:wpi="http://schemas.microsoft.com/office/word/2010/wordprocessingInk" xmlns:wne="http://schemas.microsoft.com/office/word/2006/wordml" xmlns:wps="http://schemas.microsoft.com/office/word/2010/wordprocessingShape" mc:Ignorable="w14 w15 w16se w16cid w16 w16cex wp14">
+<w:numbering xmlns:wpc="http://schemas.microsoft.com/office/word/2010/wordprocessingCanvas" xmlns:cx="http://schemas.microsoft.com/office/drawing/2014/chartex" xmlns:cx1="http://schemas.microsoft.com/office/drawing/2015/9/8/chartex" xmlns:cx2="http://schemas.microsoft.com/office/drawing/2015/10/21/chartex" xmlns:cx3="http://schemas.microsoft.com/office/drawing/2016/5/9/chartex" xmlns:cx4="http://schemas.microsoft.com/office/drawing/2016/5/10/chartex" xmlns:cx5="http://schemas.microsoft.com/office/drawing/2016/5/11/chartex" xmlns:cx6="http://schemas.microsoft.com/office/drawing/2016/5/12/chartex" xmlns:cx7="http://schemas.microsoft.com/office/drawing/2016/5/13/chartex" xmlns:cx8="http://schemas.microsoft.com/office/drawing/2016/5/14/chartex" xmlns:mc="http://schemas.openxmlformats.org/markup-compatibility/2006" xmlns:aink="http://schemas.microsoft.com/office/drawing/2016/ink" xmlns:am3d="http://schemas.microsoft.com/office/drawing/2017/model3d" xmlns:o="urn:schemas-microsoft-com:office:office" xmlns:oel="http://schemas.microsoft.com/office/2019/extlst" xmlns:r="http://schemas.openxmlformats.org/officeDocument/2006/relationships" xmlns:m="http://schemas.openxmlformats.org/officeDocument/2006/math" xmlns:v="urn:schemas-microsoft-com:vml" xmlns:wp14="http://schemas.microsoft.com/office/word/2010/wordprocessingDrawing" xmlns:wp="http://schemas.openxmlformats.org/drawingml/2006/wordprocessingDrawing" xmlns:w10="urn:schemas-microsoft-com:office:word" xmlns:w="http://schemas.openxmlformats.org/wordprocessingml/2006/main" xmlns:w14="http://schemas.microsoft.com/office/word/2010/wordml" xmlns:w15="http://schemas.microsoft.com/office/word/2012/wordml" xmlns:w16cex="http://schemas.microsoft.com/office/word/2018/wordml/cex" xmlns:w16cid="http://schemas.microsoft.com/office/word/2016/wordml/cid" xmlns:w16="http://schemas.microsoft.com/office/word/2018/wordml" xmlns:w16du="http://schemas.microsoft.com/office/word/2023/wordml/word16du" xmlns:w16sdtdh="http://schemas.microsoft.com/office/word/2020/wordml/sdtdatahash" xmlns:w16sdtfl="http://schemas.microsoft.com/office/word/2024/wordml/sdtformatlock" xmlns:w16se="http://schemas.microsoft.com/office/word/2015/wordml/symex" xmlns:wpg="http://schemas.microsoft.com/office/word/2010/wordprocessingGroup" xmlns:wpi="http://schemas.microsoft.com/office/word/2010/wordprocessingInk" xmlns:wne="http://schemas.microsoft.com/office/word/2006/wordml" xmlns:wps="http://schemas.microsoft.com/office/word/2010/wordprocessingShape" mc:Ignorable="w14 w15 w16se w16cid w16 w16cex w16sdtdh w16sdtfl w16du wp14">
   <w:abstractNum w:abstractNumId="0" w15:restartNumberingAfterBreak="0">
     <w:nsid w:val="1B997800"/>
     <w:multiLevelType w:val="multilevel"/>
@@ -1177,17 +951,17 @@
       </w:rPr>
     </w:lvl>
   </w:abstractNum>
-  <w:num w:numId="1">
+  <w:num w:numId="1" w16cid:durableId="634919795">
     <w:abstractNumId w:val="1"/>
   </w:num>
-  <w:num w:numId="2">
+  <w:num w:numId="2" w16cid:durableId="1096172811">
     <w:abstractNumId w:val="0"/>
   </w:num>
 </w:numbering>
 </file>
 
 <file path=word/styles.xml><?xml version="1.0" encoding="utf-8"?>
-<w:styles xmlns:mc="http://schemas.openxmlformats.org/markup-compatibility/2006" xmlns:r="http://schemas.openxmlformats.org/officeDocument/2006/relationships" xmlns:w="http://schemas.openxmlformats.org/wordprocessingml/2006/main" xmlns:w14="http://schemas.microsoft.com/office/word/2010/wordml" xmlns:w15="http://schemas.microsoft.com/office/word/2012/wordml" xmlns:w16cex="http://schemas.microsoft.com/office/word/2018/wordml/cex" xmlns:w16cid="http://schemas.microsoft.com/office/word/2016/wordml/cid" xmlns:w16="http://schemas.microsoft.com/office/word/2018/wordml" xmlns:w16se="http://schemas.microsoft.com/office/word/2015/wordml/symex" mc:Ignorable="w14 w15 w16se w16cid w16 w16cex">
+<w:styles xmlns:mc="http://schemas.openxmlformats.org/markup-compatibility/2006" xmlns:r="http://schemas.openxmlformats.org/officeDocument/2006/relationships" xmlns:w="http://schemas.openxmlformats.org/wordprocessingml/2006/main" xmlns:w14="http://schemas.microsoft.com/office/word/2010/wordml" xmlns:w15="http://schemas.microsoft.com/office/word/2012/wordml" xmlns:w16cex="http://schemas.microsoft.com/office/word/2018/wordml/cex" xmlns:w16cid="http://schemas.microsoft.com/office/word/2016/wordml/cid" xmlns:w16="http://schemas.microsoft.com/office/word/2018/wordml" xmlns:w16du="http://schemas.microsoft.com/office/word/2023/wordml/word16du" xmlns:w16sdtdh="http://schemas.microsoft.com/office/word/2020/wordml/sdtdatahash" xmlns:w16sdtfl="http://schemas.microsoft.com/office/word/2024/wordml/sdtformatlock" xmlns:w16se="http://schemas.microsoft.com/office/word/2015/wordml/symex" mc:Ignorable="w14 w15 w16se w16cid w16 w16cex w16sdtdh w16sdtfl w16du">
   <w:docDefaults>
     <w:rPrDefault>
       <w:rPr>

</xml_diff>